<commit_message>
Update registrasi checklist template
</commit_message>
<xml_diff>
--- a/src/templates/registrasi/template_checklist.docx
+++ b/src/templates/registrasi/template_checklist.docx
@@ -748,14 +748,14 @@
               <w:jc w:val="center"/>
               <w:rPr>
                 <w:rFonts w:ascii="Arial" w:hAnsi="Arial" w:cs="Arial"/>
+                <w:sz w:val="20"/>
+                <w:szCs w:val="20"/>
               </w:rPr>
             </w:pPr>
             <w:r>
               <w:rPr>
                 <w:rStyle w:val="HTMLCode"/>
                 <w:rFonts w:ascii="Arial" w:eastAsiaTheme="minorHAnsi" w:hAnsi="Arial" w:cs="Arial"/>
-                <w:sz w:val="22"/>
-                <w:szCs w:val="22"/>
               </w:rPr>
               <w:t>{#persyaratan}{no}</w:t>
             </w:r>
@@ -770,14 +770,14 @@
             <w:pPr>
               <w:rPr>
                 <w:rFonts w:ascii="Arial" w:hAnsi="Arial" w:cs="Arial"/>
+                <w:sz w:val="20"/>
+                <w:szCs w:val="20"/>
               </w:rPr>
             </w:pPr>
             <w:r>
               <w:rPr>
                 <w:rStyle w:val="HTMLCode"/>
                 <w:rFonts w:ascii="Arial" w:eastAsiaTheme="minorHAnsi" w:hAnsi="Arial" w:cs="Arial"/>
-                <w:sz w:val="22"/>
-                <w:szCs w:val="22"/>
               </w:rPr>
               <w:t>{</w:t>
             </w:r>
@@ -786,8 +786,6 @@
               <w:rPr>
                 <w:rStyle w:val="HTMLCode"/>
                 <w:rFonts w:ascii="Arial" w:eastAsiaTheme="minorHAnsi" w:hAnsi="Arial" w:cs="Arial"/>
-                <w:sz w:val="22"/>
-                <w:szCs w:val="22"/>
               </w:rPr>
               <w:t>item_nama</w:t>
             </w:r>
@@ -796,8 +794,6 @@
               <w:rPr>
                 <w:rStyle w:val="HTMLCode"/>
                 <w:rFonts w:ascii="Arial" w:eastAsiaTheme="minorHAnsi" w:hAnsi="Arial" w:cs="Arial"/>
-                <w:sz w:val="22"/>
-                <w:szCs w:val="22"/>
               </w:rPr>
               <w:t>}</w:t>
             </w:r>
@@ -813,14 +809,14 @@
               <w:jc w:val="center"/>
               <w:rPr>
                 <w:rFonts w:ascii="Arial" w:hAnsi="Arial" w:cs="Arial"/>
+                <w:sz w:val="20"/>
+                <w:szCs w:val="20"/>
               </w:rPr>
             </w:pPr>
             <w:r>
               <w:rPr>
                 <w:rStyle w:val="HTMLCode"/>
                 <w:rFonts w:ascii="Arial" w:eastAsiaTheme="minorHAnsi" w:hAnsi="Arial" w:cs="Arial"/>
-                <w:sz w:val="22"/>
-                <w:szCs w:val="22"/>
               </w:rPr>
               <w:t>{ada}</w:t>
             </w:r>
@@ -836,14 +832,14 @@
               <w:jc w:val="center"/>
               <w:rPr>
                 <w:rFonts w:ascii="Arial" w:hAnsi="Arial" w:cs="Arial"/>
+                <w:sz w:val="20"/>
+                <w:szCs w:val="20"/>
               </w:rPr>
             </w:pPr>
             <w:r>
               <w:rPr>
                 <w:rStyle w:val="HTMLCode"/>
                 <w:rFonts w:ascii="Arial" w:eastAsiaTheme="minorHAnsi" w:hAnsi="Arial" w:cs="Arial"/>
-                <w:sz w:val="22"/>
-                <w:szCs w:val="22"/>
               </w:rPr>
               <w:t>{keterangan}{/persyaratan}</w:t>
             </w:r>

</xml_diff>

<commit_message>
chore: update checklist word template layout
</commit_message>
<xml_diff>
--- a/src/templates/registrasi/template_checklist.docx
+++ b/src/templates/registrasi/template_checklist.docx
@@ -1161,6 +1161,8 @@
           </w:tcPr>
           <w:p>
             <w:pPr>
+              <w:keepNext/>
+              <w:keepLines/>
               <w:jc w:val="center"/>
               <w:rPr>
                 <w:rFonts w:ascii="Arial" w:hAnsi="Arial" w:cs="Arial"/>
@@ -1181,6 +1183,8 @@
           </w:tcPr>
           <w:p>
             <w:pPr>
+              <w:keepNext/>
+              <w:keepLines/>
               <w:jc w:val="center"/>
               <w:rPr>
                 <w:rFonts w:ascii="Arial" w:hAnsi="Arial" w:cs="Arial"/>
@@ -1201,6 +1205,8 @@
           </w:tcPr>
           <w:p>
             <w:pPr>
+              <w:keepNext/>
+              <w:keepLines/>
               <w:jc w:val="center"/>
               <w:rPr>
                 <w:rFonts w:ascii="Arial" w:hAnsi="Arial" w:cs="Arial"/>
@@ -1226,6 +1232,8 @@
           </w:tcPr>
           <w:p>
             <w:pPr>
+              <w:keepNext/>
+              <w:keepLines/>
               <w:jc w:val="center"/>
               <w:rPr>
                 <w:rFonts w:ascii="Arial" w:hAnsi="Arial" w:cs="Arial"/>
@@ -1240,6 +1248,8 @@
           </w:tcPr>
           <w:p>
             <w:pPr>
+              <w:keepNext/>
+              <w:keepLines/>
               <w:jc w:val="center"/>
               <w:rPr>
                 <w:rFonts w:ascii="Arial" w:hAnsi="Arial" w:cs="Arial"/>
@@ -1254,6 +1264,8 @@
           </w:tcPr>
           <w:p>
             <w:pPr>
+              <w:keepNext/>
+              <w:keepLines/>
               <w:jc w:val="center"/>
               <w:rPr>
                 <w:rFonts w:ascii="Arial" w:hAnsi="Arial" w:cs="Arial"/>
@@ -1270,6 +1282,8 @@
           </w:tcPr>
           <w:p>
             <w:pPr>
+              <w:keepNext/>
+              <w:keepLines/>
               <w:jc w:val="center"/>
               <w:rPr>
                 <w:rFonts w:ascii="Arial" w:hAnsi="Arial" w:cs="Arial"/>
@@ -1304,6 +1318,8 @@
           </w:tcPr>
           <w:p>
             <w:pPr>
+              <w:keepNext/>
+              <w:keepLines/>
               <w:jc w:val="center"/>
               <w:rPr>
                 <w:rFonts w:ascii="Arial" w:hAnsi="Arial" w:cs="Arial"/>
@@ -1346,6 +1362,8 @@
           </w:tcPr>
           <w:p>
             <w:pPr>
+              <w:keepNext/>
+              <w:keepLines/>
               <w:jc w:val="center"/>
               <w:rPr>
                 <w:rFonts w:ascii="Arial" w:hAnsi="Arial" w:cs="Arial"/>

</xml_diff>